<commit_message>
S11: actualizar Capstone con flujo del prototipo (Figura 16) y formateo del borrador.
</commit_message>
<xml_diff>
--- a/s11/docs/S11_Borrador_Avanzado.docx
+++ b/s11/docs/S11_Borrador_Avanzado.docx
@@ -298,7 +298,8 @@
     </w:p>
     <w:p>
       <w:pPr>
-        <w:spacing w:after="90" w:line="360" w:lineRule="auto"/>
+        <w:spacing w:after="160" w:line="360" w:lineRule="auto" w:before="0"/>
+        <w:ind w:firstLine="0"/>
         <w:jc w:val="both"/>
         <w:rPr>
           <w:rFonts w:ascii="Arial" w:eastAsia="Arial" w:hAnsi="Arial" w:cs="Arial"/>
@@ -7153,22 +7154,60 @@
     <w:p>
       <w:pPr>
         <w:pStyle w:val="Ttulo2"/>
-      </w:pPr>
-      <w:r>
+        <w:spacing w:before="240" w:after="120" w:line="360" w:lineRule="auto"/>
+        <w:ind w:firstLine="0"/>
+        <w:jc w:val="left"/>
+      </w:pPr>
+      <w:r>
+        <w:rPr>
+          <w:rFonts w:ascii="Arial" w:hAnsi="Arial" w:cs="Arial" w:eastAsia="Arial"/>
+          <w:b/>
+          <w:sz w:val="20"/>
+        </w:rPr>
         <w:t>3.5. Calidad y pruebas automatizadas (S11)</w:t>
       </w:r>
     </w:p>
     <w:p>
-      <w:pPr/>
-      <w:r>
-        <w:t>La deuda explícita de S10 —pytest usado pero no declarado— se cierra en S11. El archivo requirements-dev.txt declara pytest&gt;=8.0 y pytest-cov; requirements.txt remite a ese archivo para no ensuciar el runtime. Un solo comando `python -m pytest` recoge api/, s7/test_fallback.py, s10/test_citimed_pipeline.py, s11/tests y s11/anonimizador_ocr/pruebas. Las pruebas que invocan Tesseract se marcan con @pytest.mark.requiere_ocr y se omiten si el binario no está instalado, de modo que la suite no falla en la máquina de un evaluador. El frontend se verifica con `npm test` (node --test). Evidencia: s11/evidencias/reporte_pytest.txt.</w:t>
+      <w:pPr>
+        <w:spacing w:before="0" w:after="160" w:line="360" w:lineRule="auto"/>
+        <w:ind w:firstLine="0"/>
+        <w:jc w:val="both"/>
+      </w:pPr>
+      <w:r>
+        <w:rPr>
+          <w:rFonts w:ascii="Arial" w:hAnsi="Arial" w:cs="Arial" w:eastAsia="Arial"/>
+          <w:sz w:val="20"/>
+        </w:rPr>
+        <w:t>La deuda explícita de S10 —pytest usado pero no declarado— se cierra en S11. El archivo requirements-dev.txt declara pytest&gt;=8.0 y pytest-cov; requirements.txt remite a ese archivo para no ensuciar el runtime. Un solo comando `python -m pytest` recoge api/, s7/test_fallback.py, s10/test_citimed_pipeline.py, s11/tests y s11/anonimizador_ocr/pruebas.</w:t>
+      </w:r>
+    </w:p>
+    <w:p>
+      <w:pPr>
+        <w:spacing w:before="0" w:after="160" w:line="360" w:lineRule="auto"/>
+        <w:ind w:firstLine="0"/>
+        <w:jc w:val="both"/>
+      </w:pPr>
+      <w:r>
+        <w:rPr>
+          <w:rFonts w:ascii="Arial" w:hAnsi="Arial" w:cs="Arial" w:eastAsia="Arial"/>
+          <w:sz w:val="20"/>
+        </w:rPr>
+        <w:t>Las pruebas que invocan Tesseract se marcan con @pytest.mark.requiere_ocr y se omiten si el binario no está instalado, de modo que la suite no falla en la máquina de un evaluador. El frontend se verifica con `npm test` (node --test). Evidencia: s11/evidencias/reporte_pytest.txt.</w:t>
       </w:r>
     </w:p>
     <w:p>
       <w:pPr>
         <w:pStyle w:val="Ttulo2"/>
-      </w:pPr>
-      <w:r>
+        <w:spacing w:before="240" w:after="120" w:line="360" w:lineRule="auto"/>
+        <w:ind w:firstLine="0"/>
+        <w:jc w:val="left"/>
+      </w:pPr>
+      <w:r>
+        <w:rPr>
+          <w:rFonts w:ascii="Arial" w:hAnsi="Arial" w:cs="Arial" w:eastAsia="Arial"/>
+          <w:b/>
+          <w:sz w:val="20"/>
+        </w:rPr>
         <w:t>3.6. Anonimización OCR de historias reales</w:t>
       </w:r>
     </w:p>
@@ -7273,16 +7312,46 @@
       </w:r>
     </w:p>
     <w:p>
-      <w:pPr/>
-      <w:r>
-        <w:t>El anonimizador 1.5 (s11/anonimizador_ocr/) trabaja sobre PDF escaneado: rasteriza, reconoce con Tesseract, detecta identificadores ecuatorianos y tacha a nivel de píxel. Cuatro capas: (1) reglas con dígito verificador de cédula; (2) contexto + NER spaCy; (3) tachado junto a etiquetas guiado por máscara de tinta (manuscrito); (4) zonas fijas por plantilla JSON. Corrida hc0001: 20 páginas, 127 hallazgos, 87 cajas, 1 página a revisión (confianza OCR 40,2 %). Procesamiento 77.5 s, 100 % local. Agregados sin texto: s11/evidencias/anonimizacion_agregados.json.</w:t>
+      <w:pPr>
+        <w:spacing w:before="0" w:after="160" w:line="360" w:lineRule="auto"/>
+        <w:ind w:firstLine="0"/>
+        <w:jc w:val="both"/>
+      </w:pPr>
+      <w:r>
+        <w:rPr>
+          <w:rFonts w:ascii="Arial" w:hAnsi="Arial" w:cs="Arial" w:eastAsia="Arial"/>
+          <w:sz w:val="20"/>
+        </w:rPr>
+        <w:t>El anonimizador 1.5 (s11/anonimizador_ocr/) trabaja sobre PDF escaneado: rasteriza, reconoce con Tesseract, detecta identificadores ecuatorianos y tacha a nivel de píxel. Cuatro capas: (1) reglas con dígito verificador de cédula; (2) contexto + NER spaCy; (3) tachado junto a etiquetas guiado por máscara de tinta (manuscrito); (4) zonas fijas por plantilla JSON.</w:t>
+      </w:r>
+    </w:p>
+    <w:p>
+      <w:pPr>
+        <w:spacing w:before="0" w:after="160" w:line="360" w:lineRule="auto"/>
+        <w:ind w:firstLine="0"/>
+        <w:jc w:val="both"/>
+      </w:pPr>
+      <w:r>
+        <w:rPr>
+          <w:rFonts w:ascii="Arial" w:hAnsi="Arial" w:cs="Arial" w:eastAsia="Arial"/>
+          <w:sz w:val="20"/>
+        </w:rPr>
+        <w:t>Corrida hc0001: 20 páginas, 127 hallazgos, 87 cajas, 1 página a revisión (confianza OCR 40,2 %). Procesamiento 77.5 s, 100 % local. Agregados sin texto: s11/evidencias/anonimizacion_agregados.json.</w:t>
       </w:r>
     </w:p>
     <w:p>
       <w:pPr>
         <w:pStyle w:val="Ttulo2"/>
-      </w:pPr>
-      <w:r>
+        <w:spacing w:before="240" w:after="120" w:line="360" w:lineRule="auto"/>
+        <w:ind w:firstLine="0"/>
+        <w:jc w:val="left"/>
+      </w:pPr>
+      <w:r>
+        <w:rPr>
+          <w:rFonts w:ascii="Arial" w:hAnsi="Arial" w:cs="Arial" w:eastAsia="Arial"/>
+          <w:b/>
+          <w:sz w:val="20"/>
+        </w:rPr>
         <w:t>3.7. Verificación humana y recall de de-identificación</w:t>
       </w:r>
     </w:p>
@@ -7337,30 +7406,90 @@
       </w:r>
     </w:p>
     <w:p>
-      <w:pPr/>
-      <w:r>
-        <w:t>Los 127 hallazgos dicen qué se detectó, no cuántos identificadores había. S11 consolida una primera pasada sobre la capa de texto del PDF ya tachado (--buscable) más los conteos del pipeline. Resultado (cota inferior de presentes = tachados + residuos de capa de texto): recall CEDULA = 1,000, HC = 1,000, DIRECCION = 1,000, NOMBRE = 0,898. El criterio de bloqueo (100 % en NOMBRE, CÉDULA y HC) no se cumple aún en NOMBRE: el tamizado halló 13 residuos de categoría NOMBRE en 11 oraciones, que se omitieron del corpus (ciclo de corrección). CÉDULA y HC sí cumplen el 100 % en esta capa. La página 10 se reporta aparte (manuscrito, confianza 40,2 %). La revisión visual dual de las 20 páginas originales sigue siendo el protocolo (s11/docs/protocolo_verificacion_humana.md); este informe no publica texto ni imágenes de revisión. Registro: s11/evidencias/verificacion_humana.csv.</w:t>
+      <w:pPr>
+        <w:spacing w:before="0" w:after="160" w:line="360" w:lineRule="auto"/>
+        <w:ind w:firstLine="0"/>
+        <w:jc w:val="both"/>
+      </w:pPr>
+      <w:r>
+        <w:rPr>
+          <w:rFonts w:ascii="Arial" w:hAnsi="Arial" w:cs="Arial" w:eastAsia="Arial"/>
+          <w:sz w:val="20"/>
+        </w:rPr>
+        <w:t>Los 127 hallazgos dicen qué se detectó, no cuántos identificadores había. S11 consolida una primera pasada sobre la capa de texto del PDF ya tachado (--buscable) más los conteos del pipeline. Resultado (cota inferior de presentes = tachados + residuos de capa de texto): recall CEDULA = 1,000, HC = 1,000, DIRECCION = 1,000, NOMBRE = 0,898.</w:t>
+      </w:r>
+    </w:p>
+    <w:p>
+      <w:pPr>
+        <w:spacing w:before="0" w:after="160" w:line="360" w:lineRule="auto"/>
+        <w:ind w:firstLine="0"/>
+        <w:jc w:val="both"/>
+      </w:pPr>
+      <w:r>
+        <w:rPr>
+          <w:rFonts w:ascii="Arial" w:hAnsi="Arial" w:cs="Arial" w:eastAsia="Arial"/>
+          <w:sz w:val="20"/>
+        </w:rPr>
+        <w:t>El criterio de bloqueo (100 % en NOMBRE, CÉDULA y HC) no se cumple aún en NOMBRE: el tamizado halló 13 residuos de categoría NOMBRE en 11 oraciones, que se omitieron del corpus (ciclo de corrección). CÉDULA y HC sí cumplen el 100 % en esta capa. La página 10 se reporta aparte (manuscrito, confianza 40,2 %). La revisión visual dual de las 20 páginas originales sigue siendo el protocolo (s11/docs/protocolo_verificacion_humana.md); este informe no publica texto ni imágenes de revisión. Registro: s11/evidencias/verificacion_humana.csv.</w:t>
       </w:r>
     </w:p>
     <w:p>
       <w:pPr>
         <w:pStyle w:val="Ttulo2"/>
-      </w:pPr>
-      <w:r>
+        <w:spacing w:before="240" w:after="120" w:line="360" w:lineRule="auto"/>
+        <w:ind w:firstLine="0"/>
+        <w:jc w:val="left"/>
+      </w:pPr>
+      <w:r>
+        <w:rPr>
+          <w:rFonts w:ascii="Arial" w:hAnsi="Arial" w:cs="Arial" w:eastAsia="Arial"/>
+          <w:b/>
+          <w:sz w:val="20"/>
+        </w:rPr>
         <w:t>3.8. Corpus CITIMED anotado (muestra piloto)</w:t>
       </w:r>
     </w:p>
     <w:p>
-      <w:pPr/>
-      <w:r>
-        <w:t>Desde el PDF buscable se segmentaron oraciones con el mismo criterio de utilidad clínica. Tras omitir residuos: 96 oraciones extraídas de 20 páginas, más 4 oraciones de la plantilla odontológica etiquetada. Total de evaluación: 100 oraciones, 2 positivas (prevalencia 0.02). Doble ciego sobre 29 oraciones: kappa de Cohen = 1.0. Eval cross-domain MEDEC→CITIMED: ROC-AUC 0,735, AUPRC 0,269. Es una muestra piloto (por debajo de 500–1000 oraciones sugeridas en S7), declarada como tal. El CSV no se versiona; agregados en s11/evidencias/reporte_anotacion.json. Guía: s11/docs/guia_anotacion.md.</w:t>
+      <w:pPr>
+        <w:spacing w:before="0" w:after="160" w:line="360" w:lineRule="auto"/>
+        <w:ind w:firstLine="0"/>
+        <w:jc w:val="both"/>
+      </w:pPr>
+      <w:r>
+        <w:rPr>
+          <w:rFonts w:ascii="Arial" w:hAnsi="Arial" w:cs="Arial" w:eastAsia="Arial"/>
+          <w:sz w:val="20"/>
+        </w:rPr>
+        <w:t>Desde el PDF buscable se segmentaron oraciones con el mismo criterio de utilidad clínica. Tras omitir residuos: 96 oraciones extraídas de 20 páginas, más 4 oraciones de la plantilla odontológica etiquetada. Total de evaluación: 100 oraciones, 2 positivas (prevalencia 0.02).</w:t>
+      </w:r>
+    </w:p>
+    <w:p>
+      <w:pPr>
+        <w:spacing w:before="0" w:after="160" w:line="360" w:lineRule="auto"/>
+        <w:ind w:firstLine="0"/>
+        <w:jc w:val="both"/>
+      </w:pPr>
+      <w:r>
+        <w:rPr>
+          <w:rFonts w:ascii="Arial" w:hAnsi="Arial" w:cs="Arial" w:eastAsia="Arial"/>
+          <w:sz w:val="20"/>
+        </w:rPr>
+        <w:t>Doble ciego sobre 29 oraciones: kappa de Cohen = 1.0. Eval cross-domain MEDEC→CITIMED: ROC-AUC 0,735, AUPRC 0,269. Es una muestra piloto (por debajo de 500–1000 oraciones sugeridas en S7), declarada como tal. El CSV no se versiona; agregados en s11/evidencias/reporte_anotacion.json. Guía: s11/docs/guia_anotacion.md.</w:t>
       </w:r>
     </w:p>
     <w:p>
       <w:pPr>
         <w:pStyle w:val="Ttulo2"/>
-      </w:pPr>
-      <w:r>
+        <w:spacing w:before="240" w:after="120" w:line="360" w:lineRule="auto"/>
+        <w:ind w:firstLine="0"/>
+        <w:jc w:val="left"/>
+      </w:pPr>
+      <w:r>
+        <w:rPr>
+          <w:rFonts w:ascii="Arial" w:hAnsi="Arial" w:cs="Arial" w:eastAsia="Arial"/>
+          <w:b/>
+          <w:sz w:val="20"/>
+        </w:rPr>
         <w:t>4.4. Evaluación con LLM real (cierre de la limitación mock)</w:t>
       </w:r>
     </w:p>
@@ -7415,16 +7544,60 @@
       </w:r>
     </w:p>
     <w:p>
-      <w:pPr/>
-      <w:r>
-        <w:t>S10 reportó los brazos LLM en modo mock (ROC-AUC ≈ 0,50). S11 ejecutó eval_tripartita sobre 400 oraciones del test MEDEC con gpt-4o-mini (temperature=0, mock=false). MEDEC es público; CITIMED sigue reservado a Ollama on-premise. Resultados: TF-IDF ROC-AUC 0,948, AUPRC 0,406; LLM zero-shot 0,509 / 0,054 (587,2 ms/oración, USD 0,0128 / 1000); LLM+RAG 0,507 / 0,053 (USD 0,0300 / 1000). Mock vs real (zero-shot): 0,498 → 0,509. El LLM real no supera a TF-IDF; la ventaja léxica deja de atribuirse al mock. McNemar TF-IDF vs zero-shot p = 0,060. Costo medido inferior a la estimación de S7 (0,08 USD/1000). Evidencia: s11/evidencias/metricas_llm_real.json.</w:t>
+      <w:pPr>
+        <w:spacing w:before="0" w:after="160" w:line="360" w:lineRule="auto"/>
+        <w:ind w:firstLine="0"/>
+        <w:jc w:val="both"/>
+      </w:pPr>
+      <w:r>
+        <w:rPr>
+          <w:rFonts w:ascii="Arial" w:hAnsi="Arial" w:cs="Arial" w:eastAsia="Arial"/>
+          <w:sz w:val="20"/>
+        </w:rPr>
+        <w:t>S10 reportó los brazos LLM en modo mock (ROC-AUC ≈ 0,50). S11 ejecutó eval_tripartita sobre 400 oraciones del test MEDEC con gpt-4o-mini (temperature=0, mock=false). MEDEC es público; CITIMED sigue reservado a Ollama on-premise.</w:t>
+      </w:r>
+    </w:p>
+    <w:p>
+      <w:pPr>
+        <w:spacing w:before="0" w:after="160" w:line="360" w:lineRule="auto"/>
+        <w:ind w:firstLine="0"/>
+        <w:jc w:val="both"/>
+      </w:pPr>
+      <w:r>
+        <w:rPr>
+          <w:rFonts w:ascii="Arial" w:hAnsi="Arial" w:cs="Arial" w:eastAsia="Arial"/>
+          <w:sz w:val="20"/>
+        </w:rPr>
+        <w:t>Resultados: TF-IDF ROC-AUC 0,948, AUPRC 0,406; LLM zero-shot 0,509 / 0,054 (587,2 ms/oración, USD 0,0128 / 1000); LLM+RAG 0,507 / 0,053 (USD 0,0300 / 1000). Mock vs real (zero-shot): 0,498 → 0,509.</w:t>
+      </w:r>
+    </w:p>
+    <w:p>
+      <w:pPr>
+        <w:spacing w:before="0" w:after="160" w:line="360" w:lineRule="auto"/>
+        <w:ind w:firstLine="0"/>
+        <w:jc w:val="both"/>
+      </w:pPr>
+      <w:r>
+        <w:rPr>
+          <w:rFonts w:ascii="Arial" w:hAnsi="Arial" w:cs="Arial" w:eastAsia="Arial"/>
+          <w:sz w:val="20"/>
+        </w:rPr>
+        <w:t>El LLM real no supera a TF-IDF; la ventaja léxica deja de atribuirse al mock. McNemar TF-IDF vs zero-shot p = 0,060. Costo medido inferior a la estimación de S7 (0,08 USD/1000). Evidencia: s11/evidencias/metricas_llm_real.json.</w:t>
       </w:r>
     </w:p>
     <w:p>
       <w:pPr>
         <w:pStyle w:val="Ttulo2"/>
-      </w:pPr>
-      <w:r>
+        <w:spacing w:before="240" w:after="120" w:line="360" w:lineRule="auto"/>
+        <w:ind w:firstLine="0"/>
+        <w:jc w:val="left"/>
+      </w:pPr>
+      <w:r>
+        <w:rPr>
+          <w:rFonts w:ascii="Arial" w:hAnsi="Arial" w:cs="Arial" w:eastAsia="Arial"/>
+          <w:b/>
+          <w:sz w:val="20"/>
+        </w:rPr>
         <w:t>5. Prototipo: historial SQLite y rediseño UI</w:t>
       </w:r>
     </w:p>
@@ -7529,70 +7702,691 @@
       </w:r>
     </w:p>
     <w:p>
-      <w:pPr/>
-      <w:r>
-        <w:t>Entre S10 y S11 el prototipo pasó de demostración efímera a aplicación con estado. api/db.py persiste análisis en SQLite (UUID, marca UTC, resultado JSON, tope HISTORIAL_MAX_ITEMS=50). Rutas GET/DELETE /historial y /health ampliado. La interfaz React es un espacio de tres zonas (historial, nota, hallazgo) con disclaimer fijo, contraste verificado y prefers-reduced-motion. 14 pruebas de frontend en verde. Capturas: s11/evidencias/capturas/prototipo_*.png. s11/capture_prototipo.py reemplaza al inexistente s10/capture_demo.py.</w:t>
+      <w:pPr>
+        <w:spacing w:before="0" w:after="160" w:line="360" w:lineRule="auto"/>
+        <w:ind w:firstLine="0"/>
+        <w:jc w:val="both"/>
+      </w:pPr>
+      <w:r>
+        <w:rPr>
+          <w:rFonts w:ascii="Arial" w:hAnsi="Arial" w:cs="Arial" w:eastAsia="Arial"/>
+          <w:sz w:val="20"/>
+        </w:rPr>
+        <w:t>Entre S10 y S11 el prototipo pasó de demostración efímera a aplicación con estado. api/db.py persiste análisis en SQLite (UUID, marca UTC, resultado JSON, tope HISTORIAL_MAX_ITEMS=50). Rutas GET/DELETE /historial y /health ampliado.</w:t>
+      </w:r>
+    </w:p>
+    <w:p>
+      <w:pPr>
+        <w:spacing w:before="0" w:after="160" w:line="360" w:lineRule="auto"/>
+        <w:ind w:firstLine="0"/>
+        <w:jc w:val="both"/>
+      </w:pPr>
+      <w:r>
+        <w:rPr>
+          <w:rFonts w:ascii="Arial" w:hAnsi="Arial" w:cs="Arial" w:eastAsia="Arial"/>
+          <w:sz w:val="20"/>
+        </w:rPr>
+        <w:t>La interfaz React es un espacio de tres zonas (historial, nota, hallazgo) con disclaimer fijo, contraste verificado y prefers-reduced-motion. 14 pruebas de frontend en verde. Capturas: s11/evidencias/capturas/prototipo_*.png. s11/capture_prototipo.py reemplaza al inexistente s10/capture_demo.py.</w:t>
       </w:r>
     </w:p>
     <w:p>
       <w:pPr>
         <w:pStyle w:val="Ttulo2"/>
-      </w:pPr>
-      <w:r>
+        <w:spacing w:before="240" w:after="120" w:line="360" w:lineRule="auto"/>
+        <w:ind w:firstLine="0"/>
+        <w:jc w:val="left"/>
+      </w:pPr>
+      <w:r>
+        <w:rPr>
+          <w:rFonts w:ascii="Arial" w:hAnsi="Arial" w:cs="Arial" w:eastAsia="Arial"/>
+          <w:b/>
+          <w:sz w:val="20"/>
+        </w:rPr>
         <w:t>6. Ética y privacidad (ampliada)</w:t>
       </w:r>
     </w:p>
     <w:p>
-      <w:pPr/>
-      <w:r>
-        <w:t>MEDEC (público, inglés) admite API externa. CITIMED (historias reales, español) no sale del equipo: de-identificación local, Ollama on-premise, originales y PNG de revisión fuera de git. Categorías redactadas alineadas con Safe Harbor HIPAA adaptadas a Ecuador (cédula con dígito verificador, RUC, HC, teléfono, correo, fecha de nacimiento, dirección, edad ≥ 90). Autorización institucional de CITIMED para uso académico confirmada por el grupo; el documento de respaldo se conserva offline. Anexo: s11/docs/anexo_etico.md.</w:t>
+      <w:pPr>
+        <w:spacing w:before="0" w:after="160" w:line="360" w:lineRule="auto"/>
+        <w:ind w:firstLine="0"/>
+        <w:jc w:val="both"/>
+      </w:pPr>
+      <w:r>
+        <w:rPr>
+          <w:rFonts w:ascii="Arial" w:hAnsi="Arial" w:cs="Arial" w:eastAsia="Arial"/>
+          <w:sz w:val="20"/>
+        </w:rPr>
+        <w:t>MEDEC (público, inglés) admite API externa. CITIMED (historias reales, español) no sale del equipo: de-identificación local, Ollama on-premise, originales y PNG de revisión fuera de git. Categorías redactadas alineadas con Safe Harbor HIPAA adaptadas a Ecuador (cédula con dígito verificador, RUC, HC, teléfono, correo, fecha de nacimiento, dirección, edad ≥ 90).</w:t>
+      </w:r>
+    </w:p>
+    <w:p>
+      <w:pPr>
+        <w:spacing w:before="0" w:after="160" w:line="360" w:lineRule="auto"/>
+        <w:ind w:firstLine="0"/>
+        <w:jc w:val="both"/>
+      </w:pPr>
+      <w:r>
+        <w:rPr>
+          <w:rFonts w:ascii="Arial" w:hAnsi="Arial" w:cs="Arial" w:eastAsia="Arial"/>
+          <w:sz w:val="20"/>
+        </w:rPr>
+        <w:t>La autorización institucional de CITIMED para uso académico está confirmada por el grupo; el documento de respaldo se conserva offline. Anexo: s11/docs/anexo_etico.md.</w:t>
       </w:r>
     </w:p>
     <w:p>
       <w:pPr>
         <w:pStyle w:val="Ttulo2"/>
-      </w:pPr>
-      <w:r>
+        <w:spacing w:before="240" w:after="120" w:line="360" w:lineRule="auto"/>
+        <w:ind w:firstLine="0"/>
+        <w:jc w:val="left"/>
+      </w:pPr>
+      <w:r>
+        <w:rPr>
+          <w:rFonts w:ascii="Arial" w:hAnsi="Arial" w:cs="Arial" w:eastAsia="Arial"/>
+          <w:b/>
+          <w:sz w:val="20"/>
+        </w:rPr>
         <w:t>7.2. Trazabilidad S10 → S11</w:t>
       </w:r>
     </w:p>
     <w:p>
-      <w:pPr/>
-      <w:r>
-        <w:t>Observación S10 · Acción S11 · Evidencia · Estado. (1) Declarar pytest · requirements-dev.txt + suite unificada · reporte_pytest.txt · Cerrado. (2) Evaluación LLM en mock · eval_tripartita con gpt-4o-mini, n=400 · metricas_llm_real.json · Cerrado. (3) Corpus CITIMED con aval ético · anonimizador OCR + PDF buscable + anotación piloto + anexo ético · anonimizacion_agregados.json, reporte_anotacion.json, anexo_etico.md · Avance piloto (n &lt; 500). (4) PDF breve / capturas faltantes · figuras embebidas y captura del frontend rediseñado · s11/evidencias/capturas/ · Cerrado. (5) capture_demo.py referenciado pero ausente · capture_prototipo.py + wrapper · Cerrado.</w:t>
-      </w:r>
-    </w:p>
+      <w:pPr>
+        <w:spacing w:before="0" w:after="160" w:line="360" w:lineRule="auto"/>
+        <w:ind w:firstLine="0"/>
+        <w:jc w:val="both"/>
+      </w:pPr>
+      <w:r>
+        <w:rPr>
+          <w:rFonts w:ascii="Arial" w:hAnsi="Arial" w:cs="Arial" w:eastAsia="Arial"/>
+          <w:sz w:val="20"/>
+        </w:rPr>
+        <w:t>La tabla siguiente replica el formato de trazabilidad que el profesor valoró en S7, ahora aplicado a las observaciones de S10. Cada fila declara la deuda, la acción ejecutada, la evidencia reproducible y el estado.</w:t>
+      </w:r>
+    </w:p>
+    <w:tbl>
+      <w:tblPr>
+        <w:tblW w:type="auto" w:w="0"/>
+        <w:tblLayout w:type="fixed"/>
+        <w:tblLook w:firstColumn="1" w:firstRow="1" w:lastColumn="0" w:lastRow="0" w:noHBand="0" w:noVBand="1" w:val="04A0"/>
+        <w:tblBorders>
+          <w:top w:val="single" w:sz="4" w:space="0" w:color="666666"/>
+          <w:left w:val="single" w:sz="4" w:space="0" w:color="666666"/>
+          <w:bottom w:val="single" w:sz="4" w:space="0" w:color="666666"/>
+          <w:right w:val="single" w:sz="4" w:space="0" w:color="666666"/>
+          <w:insideH w:val="single" w:sz="4" w:space="0" w:color="666666"/>
+          <w:insideV w:val="single" w:sz="4" w:space="0" w:color="666666"/>
+        </w:tblBorders>
+      </w:tblPr>
+      <w:tblGrid>
+        <w:gridCol w:w="2124"/>
+        <w:gridCol w:w="2124"/>
+        <w:gridCol w:w="2124"/>
+        <w:gridCol w:w="2124"/>
+      </w:tblGrid>
+      <w:tr>
+        <w:tc>
+          <w:tcPr>
+            <w:tcW w:type="dxa" w:w="2041"/>
+          </w:tcPr>
+          <w:p>
+            <w:pPr>
+              <w:spacing w:after="40" w:line="276" w:lineRule="auto"/>
+              <w:ind w:firstLine="0"/>
+              <w:jc w:val="left"/>
+            </w:pPr>
+            <w:r>
+              <w:rPr>
+                <w:rFonts w:ascii="Arial" w:hAnsi="Arial" w:cs="Arial" w:eastAsia="Arial"/>
+                <w:b/>
+                <w:sz w:val="18"/>
+              </w:rPr>
+              <w:t>Observación S10</w:t>
+            </w:r>
+          </w:p>
+        </w:tc>
+        <w:tc>
+          <w:tcPr>
+            <w:tcW w:type="dxa" w:w="2494"/>
+          </w:tcPr>
+          <w:p>
+            <w:pPr>
+              <w:spacing w:after="40" w:line="276" w:lineRule="auto"/>
+              <w:ind w:firstLine="0"/>
+              <w:jc w:val="left"/>
+            </w:pPr>
+            <w:r>
+              <w:rPr>
+                <w:rFonts w:ascii="Arial" w:hAnsi="Arial" w:cs="Arial" w:eastAsia="Arial"/>
+                <w:b/>
+                <w:sz w:val="18"/>
+              </w:rPr>
+              <w:t>Acción S11</w:t>
+            </w:r>
+          </w:p>
+        </w:tc>
+        <w:tc>
+          <w:tcPr>
+            <w:tcW w:type="dxa" w:w="3175"/>
+          </w:tcPr>
+          <w:p>
+            <w:pPr>
+              <w:spacing w:after="40" w:line="276" w:lineRule="auto"/>
+              <w:ind w:firstLine="0"/>
+              <w:jc w:val="left"/>
+            </w:pPr>
+            <w:r>
+              <w:rPr>
+                <w:rFonts w:ascii="Arial" w:hAnsi="Arial" w:cs="Arial" w:eastAsia="Arial"/>
+                <w:b/>
+                <w:sz w:val="18"/>
+              </w:rPr>
+              <w:t>Evidencia</w:t>
+            </w:r>
+          </w:p>
+        </w:tc>
+        <w:tc>
+          <w:tcPr>
+            <w:tcW w:type="dxa" w:w="1361"/>
+          </w:tcPr>
+          <w:p>
+            <w:pPr>
+              <w:spacing w:after="40" w:line="276" w:lineRule="auto"/>
+              <w:ind w:firstLine="0"/>
+              <w:jc w:val="left"/>
+            </w:pPr>
+            <w:r>
+              <w:rPr>
+                <w:rFonts w:ascii="Arial" w:hAnsi="Arial" w:cs="Arial" w:eastAsia="Arial"/>
+                <w:b/>
+                <w:sz w:val="18"/>
+              </w:rPr>
+              <w:t>Estado</w:t>
+            </w:r>
+          </w:p>
+        </w:tc>
+      </w:tr>
+      <w:tr>
+        <w:tc>
+          <w:tcPr>
+            <w:tcW w:type="dxa" w:w="2041"/>
+          </w:tcPr>
+          <w:p>
+            <w:pPr>
+              <w:spacing w:after="40" w:line="276" w:lineRule="auto"/>
+              <w:ind w:firstLine="0"/>
+              <w:jc w:val="left"/>
+            </w:pPr>
+            <w:r>
+              <w:rPr>
+                <w:rFonts w:ascii="Arial" w:hAnsi="Arial" w:cs="Arial" w:eastAsia="Arial"/>
+                <w:b w:val="0"/>
+                <w:sz w:val="18"/>
+              </w:rPr>
+              <w:t>Declarar pytest en requirements</w:t>
+            </w:r>
+          </w:p>
+        </w:tc>
+        <w:tc>
+          <w:tcPr>
+            <w:tcW w:type="dxa" w:w="2494"/>
+          </w:tcPr>
+          <w:p>
+            <w:pPr>
+              <w:spacing w:after="40" w:line="276" w:lineRule="auto"/>
+              <w:ind w:firstLine="0"/>
+              <w:jc w:val="left"/>
+            </w:pPr>
+            <w:r>
+              <w:rPr>
+                <w:rFonts w:ascii="Arial" w:hAnsi="Arial" w:cs="Arial" w:eastAsia="Arial"/>
+                <w:b w:val="0"/>
+                <w:sz w:val="18"/>
+              </w:rPr>
+              <w:t>requirements-dev.txt y suite unificada</w:t>
+            </w:r>
+          </w:p>
+        </w:tc>
+        <w:tc>
+          <w:tcPr>
+            <w:tcW w:type="dxa" w:w="3175"/>
+          </w:tcPr>
+          <w:p>
+            <w:pPr>
+              <w:spacing w:after="40" w:line="276" w:lineRule="auto"/>
+              <w:ind w:firstLine="0"/>
+              <w:jc w:val="left"/>
+            </w:pPr>
+            <w:r>
+              <w:rPr>
+                <w:rFonts w:ascii="Arial" w:hAnsi="Arial" w:cs="Arial" w:eastAsia="Arial"/>
+                <w:b w:val="0"/>
+                <w:sz w:val="18"/>
+              </w:rPr>
+              <w:t>s11/evidencias/reporte_pytest.txt</w:t>
+            </w:r>
+          </w:p>
+        </w:tc>
+        <w:tc>
+          <w:tcPr>
+            <w:tcW w:type="dxa" w:w="1361"/>
+          </w:tcPr>
+          <w:p>
+            <w:pPr>
+              <w:spacing w:after="40" w:line="276" w:lineRule="auto"/>
+              <w:ind w:firstLine="0"/>
+              <w:jc w:val="left"/>
+            </w:pPr>
+            <w:r>
+              <w:rPr>
+                <w:rFonts w:ascii="Arial" w:hAnsi="Arial" w:cs="Arial" w:eastAsia="Arial"/>
+                <w:b w:val="0"/>
+                <w:sz w:val="18"/>
+              </w:rPr>
+              <w:t>Cerrado</w:t>
+            </w:r>
+          </w:p>
+        </w:tc>
+      </w:tr>
+      <w:tr>
+        <w:tc>
+          <w:tcPr>
+            <w:tcW w:type="dxa" w:w="2041"/>
+          </w:tcPr>
+          <w:p>
+            <w:pPr>
+              <w:spacing w:after="40" w:line="276" w:lineRule="auto"/>
+              <w:ind w:firstLine="0"/>
+              <w:jc w:val="left"/>
+            </w:pPr>
+            <w:r>
+              <w:rPr>
+                <w:rFonts w:ascii="Arial" w:hAnsi="Arial" w:cs="Arial" w:eastAsia="Arial"/>
+                <w:b w:val="0"/>
+                <w:sz w:val="18"/>
+              </w:rPr>
+              <w:t>Evaluación LLM en mock</w:t>
+            </w:r>
+          </w:p>
+        </w:tc>
+        <w:tc>
+          <w:tcPr>
+            <w:tcW w:type="dxa" w:w="2494"/>
+          </w:tcPr>
+          <w:p>
+            <w:pPr>
+              <w:spacing w:after="40" w:line="276" w:lineRule="auto"/>
+              <w:ind w:firstLine="0"/>
+              <w:jc w:val="left"/>
+            </w:pPr>
+            <w:r>
+              <w:rPr>
+                <w:rFonts w:ascii="Arial" w:hAnsi="Arial" w:cs="Arial" w:eastAsia="Arial"/>
+                <w:b w:val="0"/>
+                <w:sz w:val="18"/>
+              </w:rPr>
+              <w:t>eval_tripartita con gpt-4o-mini (n=400)</w:t>
+            </w:r>
+          </w:p>
+        </w:tc>
+        <w:tc>
+          <w:tcPr>
+            <w:tcW w:type="dxa" w:w="3175"/>
+          </w:tcPr>
+          <w:p>
+            <w:pPr>
+              <w:spacing w:after="40" w:line="276" w:lineRule="auto"/>
+              <w:ind w:firstLine="0"/>
+              <w:jc w:val="left"/>
+            </w:pPr>
+            <w:r>
+              <w:rPr>
+                <w:rFonts w:ascii="Arial" w:hAnsi="Arial" w:cs="Arial" w:eastAsia="Arial"/>
+                <w:b w:val="0"/>
+                <w:sz w:val="18"/>
+              </w:rPr>
+              <w:t>s11/evidencias/metricas_llm_real.json</w:t>
+            </w:r>
+          </w:p>
+        </w:tc>
+        <w:tc>
+          <w:tcPr>
+            <w:tcW w:type="dxa" w:w="1361"/>
+          </w:tcPr>
+          <w:p>
+            <w:pPr>
+              <w:spacing w:after="40" w:line="276" w:lineRule="auto"/>
+              <w:ind w:firstLine="0"/>
+              <w:jc w:val="left"/>
+            </w:pPr>
+            <w:r>
+              <w:rPr>
+                <w:rFonts w:ascii="Arial" w:hAnsi="Arial" w:cs="Arial" w:eastAsia="Arial"/>
+                <w:b w:val="0"/>
+                <w:sz w:val="18"/>
+              </w:rPr>
+              <w:t>Cerrado</w:t>
+            </w:r>
+          </w:p>
+        </w:tc>
+      </w:tr>
+      <w:tr>
+        <w:tc>
+          <w:tcPr>
+            <w:tcW w:type="dxa" w:w="2041"/>
+          </w:tcPr>
+          <w:p>
+            <w:pPr>
+              <w:spacing w:after="40" w:line="276" w:lineRule="auto"/>
+              <w:ind w:firstLine="0"/>
+              <w:jc w:val="left"/>
+            </w:pPr>
+            <w:r>
+              <w:rPr>
+                <w:rFonts w:ascii="Arial" w:hAnsi="Arial" w:cs="Arial" w:eastAsia="Arial"/>
+                <w:b w:val="0"/>
+                <w:sz w:val="18"/>
+              </w:rPr>
+              <w:t>Corpus CITIMED con aval ético</w:t>
+            </w:r>
+          </w:p>
+        </w:tc>
+        <w:tc>
+          <w:tcPr>
+            <w:tcW w:type="dxa" w:w="2494"/>
+          </w:tcPr>
+          <w:p>
+            <w:pPr>
+              <w:spacing w:after="40" w:line="276" w:lineRule="auto"/>
+              <w:ind w:firstLine="0"/>
+              <w:jc w:val="left"/>
+            </w:pPr>
+            <w:r>
+              <w:rPr>
+                <w:rFonts w:ascii="Arial" w:hAnsi="Arial" w:cs="Arial" w:eastAsia="Arial"/>
+                <w:b w:val="0"/>
+                <w:sz w:val="18"/>
+              </w:rPr>
+              <w:t>Anonimizador OCR, PDF buscable, anotación piloto y anexo ético</w:t>
+            </w:r>
+          </w:p>
+        </w:tc>
+        <w:tc>
+          <w:tcPr>
+            <w:tcW w:type="dxa" w:w="3175"/>
+          </w:tcPr>
+          <w:p>
+            <w:pPr>
+              <w:spacing w:after="40" w:line="276" w:lineRule="auto"/>
+              <w:ind w:firstLine="0"/>
+              <w:jc w:val="left"/>
+            </w:pPr>
+            <w:r>
+              <w:rPr>
+                <w:rFonts w:ascii="Arial" w:hAnsi="Arial" w:cs="Arial" w:eastAsia="Arial"/>
+                <w:b w:val="0"/>
+                <w:sz w:val="18"/>
+              </w:rPr>
+              <w:t>anonimizacion_agregados.json; reporte_anotacion.json; anexo_etico.md</w:t>
+            </w:r>
+          </w:p>
+        </w:tc>
+        <w:tc>
+          <w:tcPr>
+            <w:tcW w:type="dxa" w:w="1361"/>
+          </w:tcPr>
+          <w:p>
+            <w:pPr>
+              <w:spacing w:after="40" w:line="276" w:lineRule="auto"/>
+              <w:ind w:firstLine="0"/>
+              <w:jc w:val="left"/>
+            </w:pPr>
+            <w:r>
+              <w:rPr>
+                <w:rFonts w:ascii="Arial" w:hAnsi="Arial" w:cs="Arial" w:eastAsia="Arial"/>
+                <w:b w:val="0"/>
+                <w:sz w:val="18"/>
+              </w:rPr>
+              <w:t>Avance piloto (n &lt; 500)</w:t>
+            </w:r>
+          </w:p>
+        </w:tc>
+      </w:tr>
+      <w:tr>
+        <w:tc>
+          <w:tcPr>
+            <w:tcW w:type="dxa" w:w="2041"/>
+          </w:tcPr>
+          <w:p>
+            <w:pPr>
+              <w:spacing w:after="40" w:line="276" w:lineRule="auto"/>
+              <w:ind w:firstLine="0"/>
+              <w:jc w:val="left"/>
+            </w:pPr>
+            <w:r>
+              <w:rPr>
+                <w:rFonts w:ascii="Arial" w:hAnsi="Arial" w:cs="Arial" w:eastAsia="Arial"/>
+                <w:b w:val="0"/>
+                <w:sz w:val="18"/>
+              </w:rPr>
+              <w:t>PDF breve y capturas faltantes</w:t>
+            </w:r>
+          </w:p>
+        </w:tc>
+        <w:tc>
+          <w:tcPr>
+            <w:tcW w:type="dxa" w:w="2494"/>
+          </w:tcPr>
+          <w:p>
+            <w:pPr>
+              <w:spacing w:after="40" w:line="276" w:lineRule="auto"/>
+              <w:ind w:firstLine="0"/>
+              <w:jc w:val="left"/>
+            </w:pPr>
+            <w:r>
+              <w:rPr>
+                <w:rFonts w:ascii="Arial" w:hAnsi="Arial" w:cs="Arial" w:eastAsia="Arial"/>
+                <w:b w:val="0"/>
+                <w:sz w:val="18"/>
+              </w:rPr>
+              <w:t>Figuras embebidas y capturas del frontend rediseñado</w:t>
+            </w:r>
+          </w:p>
+        </w:tc>
+        <w:tc>
+          <w:tcPr>
+            <w:tcW w:type="dxa" w:w="3175"/>
+          </w:tcPr>
+          <w:p>
+            <w:pPr>
+              <w:spacing w:after="40" w:line="276" w:lineRule="auto"/>
+              <w:ind w:firstLine="0"/>
+              <w:jc w:val="left"/>
+            </w:pPr>
+            <w:r>
+              <w:rPr>
+                <w:rFonts w:ascii="Arial" w:hAnsi="Arial" w:cs="Arial" w:eastAsia="Arial"/>
+                <w:b w:val="0"/>
+                <w:sz w:val="18"/>
+              </w:rPr>
+              <w:t>s11/evidencias/capturas/</w:t>
+            </w:r>
+          </w:p>
+        </w:tc>
+        <w:tc>
+          <w:tcPr>
+            <w:tcW w:type="dxa" w:w="1361"/>
+          </w:tcPr>
+          <w:p>
+            <w:pPr>
+              <w:spacing w:after="40" w:line="276" w:lineRule="auto"/>
+              <w:ind w:firstLine="0"/>
+              <w:jc w:val="left"/>
+            </w:pPr>
+            <w:r>
+              <w:rPr>
+                <w:rFonts w:ascii="Arial" w:hAnsi="Arial" w:cs="Arial" w:eastAsia="Arial"/>
+                <w:b w:val="0"/>
+                <w:sz w:val="18"/>
+              </w:rPr>
+              <w:t>Cerrado</w:t>
+            </w:r>
+          </w:p>
+        </w:tc>
+      </w:tr>
+      <w:tr>
+        <w:tc>
+          <w:tcPr>
+            <w:tcW w:type="dxa" w:w="2041"/>
+          </w:tcPr>
+          <w:p>
+            <w:pPr>
+              <w:spacing w:after="40" w:line="276" w:lineRule="auto"/>
+              <w:ind w:firstLine="0"/>
+              <w:jc w:val="left"/>
+            </w:pPr>
+            <w:r>
+              <w:rPr>
+                <w:rFonts w:ascii="Arial" w:hAnsi="Arial" w:cs="Arial" w:eastAsia="Arial"/>
+                <w:b w:val="0"/>
+                <w:sz w:val="18"/>
+              </w:rPr>
+              <w:t>capture_demo.py referenciado pero ausente</w:t>
+            </w:r>
+          </w:p>
+        </w:tc>
+        <w:tc>
+          <w:tcPr>
+            <w:tcW w:type="dxa" w:w="2494"/>
+          </w:tcPr>
+          <w:p>
+            <w:pPr>
+              <w:spacing w:after="40" w:line="276" w:lineRule="auto"/>
+              <w:ind w:firstLine="0"/>
+              <w:jc w:val="left"/>
+            </w:pPr>
+            <w:r>
+              <w:rPr>
+                <w:rFonts w:ascii="Arial" w:hAnsi="Arial" w:cs="Arial" w:eastAsia="Arial"/>
+                <w:b w:val="0"/>
+                <w:sz w:val="18"/>
+              </w:rPr>
+              <w:t>s11/capture_prototipo.py y wrapper de compatibilidad</w:t>
+            </w:r>
+          </w:p>
+        </w:tc>
+        <w:tc>
+          <w:tcPr>
+            <w:tcW w:type="dxa" w:w="3175"/>
+          </w:tcPr>
+          <w:p>
+            <w:pPr>
+              <w:spacing w:after="40" w:line="276" w:lineRule="auto"/>
+              <w:ind w:firstLine="0"/>
+              <w:jc w:val="left"/>
+            </w:pPr>
+            <w:r>
+              <w:rPr>
+                <w:rFonts w:ascii="Arial" w:hAnsi="Arial" w:cs="Arial" w:eastAsia="Arial"/>
+                <w:b w:val="0"/>
+                <w:sz w:val="18"/>
+              </w:rPr>
+              <w:t>s10/capture_demo.py</w:t>
+            </w:r>
+          </w:p>
+        </w:tc>
+        <w:tc>
+          <w:tcPr>
+            <w:tcW w:type="dxa" w:w="1361"/>
+          </w:tcPr>
+          <w:p>
+            <w:pPr>
+              <w:spacing w:after="40" w:line="276" w:lineRule="auto"/>
+              <w:ind w:firstLine="0"/>
+              <w:jc w:val="left"/>
+            </w:pPr>
+            <w:r>
+              <w:rPr>
+                <w:rFonts w:ascii="Arial" w:hAnsi="Arial" w:cs="Arial" w:eastAsia="Arial"/>
+                <w:b w:val="0"/>
+                <w:sz w:val="18"/>
+              </w:rPr>
+              <w:t>Cerrado</w:t>
+            </w:r>
+          </w:p>
+        </w:tc>
+      </w:tr>
+    </w:tbl>
     <w:p>
       <w:pPr>
         <w:pStyle w:val="Ttulo2"/>
-      </w:pPr>
-      <w:r>
+        <w:spacing w:before="240" w:after="120" w:line="360" w:lineRule="auto"/>
+        <w:ind w:firstLine="0"/>
+        <w:jc w:val="left"/>
+      </w:pPr>
+      <w:r>
+        <w:rPr>
+          <w:rFonts w:ascii="Arial" w:hAnsi="Arial" w:cs="Arial" w:eastAsia="Arial"/>
+          <w:b/>
+          <w:sz w:val="20"/>
+        </w:rPr>
         <w:t>7. Pitch (versión escrita)</w:t>
       </w:r>
     </w:p>
     <w:p>
-      <w:pPr/>
-      <w:r>
+      <w:pPr>
+        <w:spacing w:before="0" w:after="160" w:line="360" w:lineRule="auto"/>
+        <w:ind w:firstLine="0"/>
+        <w:jc w:val="both"/>
+      </w:pPr>
+      <w:r>
+        <w:rPr>
+          <w:rFonts w:ascii="Arial" w:hAnsi="Arial" w:cs="Arial" w:eastAsia="Arial"/>
+          <w:sz w:val="20"/>
+        </w:rPr>
         <w:t>Las inconsistencias en una historia clínica odontológica —una alergia documentada seguida de un antibiótico de la misma familia, un diagnóstico leve con un plan radical— no se ven en el encabezado de la nota: viven en una oración. El prototipo MIA_Deteccion_HC localiza esa oración. El clínico carga o pega la nota, pulsa Analizar y recibe la frase top-1 con scores TF-IDF, LLM y RAG, más el contexto de guía recuperado. No se emite un veredicto global: se señala un lugar concreto que un humano puede confirmar o descartar. En MEDEC, reformular de nota a oración elevó el ROC-AUC de 0,504 a 0,949 y localizó el error en 0,846 de las notas con error; el AUPRC es 0,419 porque la prevalencia es 4,5 %. Para CITIMED el valor está en tres propiedades de despliegue: localización verificable, cómputo on-premise (Ollama) cuando hay PHI, y fallback a TF-IDF si el modelo de lenguaje no responde. Es un prototipo de investigación; no sustituye el criterio clínico ni una decisión terapéutica.</w:t>
       </w:r>
     </w:p>
     <w:p>
-      <w:pPr/>
-      <w:r>
+      <w:pPr>
+        <w:spacing w:before="0" w:after="160" w:line="360" w:lineRule="auto"/>
+        <w:ind w:firstLine="0"/>
+        <w:jc w:val="both"/>
+      </w:pPr>
+      <w:r>
+        <w:rPr>
+          <w:rFonts w:ascii="Arial" w:hAnsi="Arial" w:cs="Arial" w:eastAsia="Arial"/>
+          <w:sz w:val="20"/>
+        </w:rPr>
         <w:t>El flujo de demostración es el de un turno real. Se abre el workspace de tres zonas; a la izquierda el historial de análisis previos; al centro la nota; a la derecha el hallazgo. Se carga el ejemplo de alergia a penicilina con prescripción de amoxicilina. El sistema marca la oración del antibiótico, muestra la barra de localización por encima del umbral y deja las frases inocuas por debajo. Si la API del LLM no está disponible, el banner de modo degradado deja claro que la alerta proviene solo de TF-IDF. Ese es el contrato con el usuario: transparencia sobre qué brazo habló y por qué.</w:t>
       </w:r>
     </w:p>
     <w:p>
       <w:pPr>
         <w:pStyle w:val="Ttulo2"/>
-      </w:pPr>
-      <w:r>
+        <w:spacing w:before="240" w:after="120" w:line="360" w:lineRule="auto"/>
+        <w:ind w:firstLine="0"/>
+        <w:jc w:val="left"/>
+      </w:pPr>
+      <w:r>
+        <w:rPr>
+          <w:rFonts w:ascii="Arial" w:hAnsi="Arial" w:cs="Arial" w:eastAsia="Arial"/>
+          <w:b/>
+          <w:sz w:val="20"/>
+        </w:rPr>
         <w:t>8. Reflexión y retroalimentación</w:t>
       </w:r>
     </w:p>
     <w:p>
-      <w:pPr/>
-      <w:r>
+      <w:pPr>
+        <w:spacing w:before="0" w:after="160" w:line="360" w:lineRule="auto"/>
+        <w:ind w:firstLine="0"/>
+        <w:jc w:val="both"/>
+      </w:pPr>
+      <w:r>
+        <w:rPr>
+          <w:rFonts w:ascii="Arial" w:hAnsi="Arial" w:cs="Arial" w:eastAsia="Arial"/>
+          <w:sz w:val="20"/>
+        </w:rPr>
         <w:t>La retroalimentación de S7 pidió AUPRC, sesgo EN-ES, análisis por tipo y riesgos de producción; S10 los implementó y el profesor valoró convertir el baseline al azar en evidencia de que el problema exige razonamiento semántico, más la tabla de trazabilidad frente a S7. En S10 pidió tres deudas concretas. pytest se declaró. El LLM real se midió: no mejora a TF-IDF, y eso se informa en lugar de seguir atribuyéndolo al mock. El corpus CITIMED avanzó con un anonimizador de escaneos reales y una muestra anotada, todavía por debajo del umbral de 500–1000 oraciones. Tres lecciones metodológicas: (i) el nivel de análisis (nota vs oración) cambia el problema más que el algoritmo; (ii) con 4,5 % de positivos el AUPRC es la métrica que obliga a la honestidad; (iii) un mock que puntúa 0,50 no es una comparación, es un placeholder, y hay que reemplazarlo aunque el resultado desfavorezca al brazo nuevo. Tres lecciones ético-organizacionales: la de-identificación precede a cualquier métrica; git no es un archivo compartido para historias; y la autorización institucional no sustituye el tachado en píxel ni la revisión humana de las páginas dudosas.</w:t>
       </w:r>
     </w:p>

</xml_diff>